<commit_message>
Align MyNUST with Level II modules and complete documentation
</commit_message>
<xml_diff>
--- a/MyNUST_Project_Speaker_Notes.docx
+++ b/MyNUST_Project_Speaker_Notes.docx
@@ -8,7 +8,7 @@
         <w:jc w:val="center"/>
       </w:pPr>
       <w:r>
-        <w:t>MyNUST Lecture Notes and Speaker Script</w:t>
+        <w:t>MyNUST Complete Project Documentation and Lecture Notes</w:t>
       </w:r>
     </w:p>
     <w:p>
@@ -16,21 +16,7 @@
         <w:jc w:val="center"/>
       </w:pPr>
       <w:r>
-        <w:t>MyNUST Student Workplace | SCS2114 Web Development | Mthokozisi Dlamini</w:t>
-      </w:r>
-    </w:p>
-    <w:p/>
-    <w:p>
-      <w:pPr>
-        <w:pStyle w:val="Heading1"/>
-      </w:pPr>
-      <w:r>
-        <w:t>Opening</w:t>
-      </w:r>
-    </w:p>
-    <w:p>
-      <w:r>
-        <w:t>Good day, lecturer and fellow students. My name is Mthokozisi Dlamini. I am presenting MyNUST, a student academic workplace developed for SCS2114 Web Development.</w:t>
+        <w:t>SCS2114 Web Development | NUST Zimbabwe | Level II | Mthokozisi Dlamini</w:t>
       </w:r>
     </w:p>
     <w:p>
@@ -38,12 +24,17 @@
         <w:pStyle w:val="Heading1"/>
       </w:pPr>
       <w:r>
-        <w:t>The problem</w:t>
+        <w:t>1. Executive summary</w:t>
       </w:r>
     </w:p>
     <w:p>
       <w:r>
-        <w:t>MyNUST responds to fragmented student information. A student should not have to search several interfaces just to understand current modules, upcoming work and personal progress.</w:t>
+        <w:t>MyNUST is a responsive student academic workplace designed for a NUST Zimbabwe Computer Science student at Level II. It keeps the three current modules visible: SORS2107 Applied Statistics for Computing, SCS2104 Structured System Analysis and Design, and SCS2114 Web Development. Students can open each module, read definitions and formulas, complete a topic checklist, enter academic evidence, write private notes and see a calculated progress result. The remaining thirteen modules can be added to an individual library when needed.</w:t>
+      </w:r>
+    </w:p>
+    <w:p>
+      <w:r>
+        <w:t>The project has two execution modes. The Flask mode uses server-side authentication, SQLite, password hashing, sessions and study-record routes. The GitHub Pages mode is a static demonstration that uses browser-local storage because GitHub Pages cannot run Python. This distinction is documented so the prototype does not claim that static hosting provides production authentication.</w:t>
       </w:r>
     </w:p>
     <w:p>
@@ -51,12 +42,17 @@
         <w:pStyle w:val="Heading1"/>
       </w:pPr>
       <w:r>
-        <w:t>Demonstration flow</w:t>
+        <w:t>2. User problem and proposed solution</w:t>
       </w:r>
     </w:p>
     <w:p>
       <w:r>
-        <w:t>I begin at the welcome screen, create or enter an account, open the dashboard, select a module, tick topics, enter academic evidence and observe the calculated progress update.</w:t>
+        <w:t>The user problem is fragmentation. Students must often move between institutional websites, portal pages, library resources, class documents and personal notes. MyNUST brings the personal academic workflow into one place: identify the student, focus on current modules, read useful subject information, record evidence and decide what to study next.</w:t>
+      </w:r>
+    </w:p>
+    <w:p>
+      <w:r>
+        <w:t>The solution is intentionally compact. The default screen does not display every module at once. Current subjects are prioritised, while the Add a module control provides scalable access to the other subjects. This is a progressive-disclosure design: the interface starts simple and reveals the wider degree archive when the student requests it.</w:t>
       </w:r>
     </w:p>
     <w:p>
@@ -64,116 +60,7 @@
         <w:pStyle w:val="Heading1"/>
       </w:pPr>
       <w:r>
-        <w:t>Progress calculation</w:t>
-      </w:r>
-    </w:p>
-    <w:p>
-      <w:r>
-        <w:t>The progress result is not a random number and it is not copied from another user. The application calculates it from completed topics, submitted assignments, quiz results, attendance and exam marks. The weights are topics twenty-five percent, assignments twenty percent, quizzes twenty percent, attendance fifteen percent and exams twenty percent.</w:t>
-      </w:r>
-    </w:p>
-    <w:p>
-      <w:pPr>
-        <w:pStyle w:val="Heading1"/>
-      </w:pPr>
-      <w:r>
-        <w:t>Algorithms</w:t>
-      </w:r>
-    </w:p>
-    <w:p>
-      <w:r>
-        <w:t>The main algorithm is weighted aggregation. The application also uses topic percentage calculation, linear search for module filtering, object-key lookup, SQL record lookup, range validation and password verification through Werkzeug. The module search is linear in the number of module records, which is appropriate for this small library.</w:t>
-      </w:r>
-    </w:p>
-    <w:p>
-      <w:pPr>
-        <w:pStyle w:val="Heading1"/>
-      </w:pPr>
-      <w:r>
-        <w:t>Data structures</w:t>
-      </w:r>
-    </w:p>
-    <w:p>
-      <w:r>
-        <w:t>The project uses a relational SQLite users table, JavaScript objects for module and student records, arrays for topics and completed indexes, JSON for browser and HTTP data, DOM collections for interface elements and a session dictionary for the authenticated user.</w:t>
-      </w:r>
-    </w:p>
-    <w:p>
-      <w:pPr>
-        <w:pStyle w:val="Heading1"/>
-      </w:pPr>
-      <w:r>
-        <w:t>Sixteen modules</w:t>
-      </w:r>
-    </w:p>
-    <w:p>
-      <w:r>
-        <w:t>All sixteen modules informed the project, but not in the same way. SCS2114, SCS1101, SCS1213, SCS1212, SCS1214, SCS1210, SORS2107, SCS2104, SCS1103, SCS1111 and the remaining systems and foundation modules each contribute a specific foundation. Some are direct implementation modules, while Electricity and Magnetism, Calculus, Linear Algebra, Digital Electronics and Architecture contribute indirectly through systems thinking, quantitative reasoning and representation of state.</w:t>
-      </w:r>
-    </w:p>
-    <w:p>
-      <w:pPr>
-        <w:pStyle w:val="Heading1"/>
-      </w:pPr>
-      <w:r>
-        <w:t>Security and ethics</w:t>
-      </w:r>
-    </w:p>
-    <w:p>
-      <w:r>
-        <w:t>The backend hashes passwords, validates input, uses parameterized queries and stores session identity securely. The public static demonstration is clearly limited because GitHub Pages cannot run Flask. A production university system would require official identity management, verified data sources, backups and audit logs.</w:t>
-      </w:r>
-    </w:p>
-    <w:p>
-      <w:pPr>
-        <w:pStyle w:val="Heading1"/>
-      </w:pPr>
-      <w:r>
-        <w:t>Closing</w:t>
-      </w:r>
-    </w:p>
-    <w:p>
-      <w:r>
-        <w:t>MyNUST demonstrates how web development can connect requirements analysis, user interface design, algorithms, data structures, databases, security and professional responsibility into one practical student-facing system. Thank you.</w:t>
-      </w:r>
-    </w:p>
-    <w:p>
-      <w:pPr>
-        <w:pStyle w:val="Heading1"/>
-      </w:pPr>
-      <w:r>
-        <w:t>System overview</w:t>
-      </w:r>
-    </w:p>
-    <w:p>
-      <w:r>
-        <w:t>MyNUST is a personalised academic workplace for NUST Computer Science students. It combines an authenticated entry point, a module library, module detail panels, topic checklists, private notes, academic evidence and calculated progress. The frontend is implemented with HTML, CSS and JavaScript. The secure version uses Flask, SQLite, Werkzeug password hashing and HTTP-only sessions.</w:t>
-      </w:r>
-    </w:p>
-    <w:p>
-      <w:pPr>
-        <w:pStyle w:val="Heading1"/>
-      </w:pPr>
-      <w:r>
-        <w:t>Progress calculation</w:t>
-      </w:r>
-    </w:p>
-    <w:p>
-      <w:r>
-        <w:t>For each module, progress is calculated from five evidence categories: completed topics 25%, submitted assignments 20%, quiz average 20%, attendance 15% and exam mark 20%. The application stores these values under the student's identity and recalculates the result whenever an input changes.</w:t>
-      </w:r>
-    </w:p>
-    <w:p>
-      <w:r>
-        <w:t>Formula: progress = (topic percentage x 0.25) + (assignment percentage x 0.20) + (quiz percentage x 0.20) + (attendance percentage x 0.15) + (exam percentage x 0.20).</w:t>
-      </w:r>
-    </w:p>
-    <w:p>
-      <w:pPr>
-        <w:pStyle w:val="Heading1"/>
-      </w:pPr>
-      <w:r>
-        <w:t>Algorithms implemented</w:t>
+        <w:t>3. Academic alignment at Level II</w:t>
       </w:r>
     </w:p>
     <w:tbl>
@@ -191,28 +78,20 @@
         <w:tc>
           <w:tcPr>
             <w:tcW w:type="dxa" w:w="4320"/>
-            <w:vAlign w:val="center"/>
           </w:tcPr>
           <w:p>
             <w:r>
-              <w:rPr>
-                <w:b/>
-              </w:rPr>
-              <w:t>Algorithm</w:t>
+              <w:t>Current module</w:t>
             </w:r>
           </w:p>
         </w:tc>
         <w:tc>
           <w:tcPr>
             <w:tcW w:type="dxa" w:w="4320"/>
-            <w:vAlign w:val="center"/>
           </w:tcPr>
           <w:p>
             <w:r>
-              <w:rPr>
-                <w:b/>
-              </w:rPr>
-              <w:t>How it is used</w:t>
+              <w:t>How it shapes the project</w:t>
             </w:r>
           </w:p>
         </w:tc>
@@ -221,22 +100,20 @@
         <w:tc>
           <w:tcPr>
             <w:tcW w:type="dxa" w:w="4320"/>
-            <w:vAlign w:val="center"/>
           </w:tcPr>
           <w:p>
             <w:r>
-              <w:t>Weighted progress aggregation</w:t>
+              <w:t>SORS2107</w:t>
             </w:r>
           </w:p>
         </w:tc>
         <w:tc>
           <w:tcPr>
             <w:tcW w:type="dxa" w:w="4320"/>
-            <w:vAlign w:val="center"/>
           </w:tcPr>
           <w:p>
             <w:r>
-              <w:t>The system calculates progress as topics*0.25 + assignments*0.20 + quiz*0.20 + attendance*0.15 + exam*0.20, then rounds the result.</w:t>
+              <w:t>Supplies the evidence model: percentages, averages, measurable performance and the weighted progress calculation.</w:t>
             </w:r>
           </w:p>
         </w:tc>
@@ -245,22 +122,20 @@
         <w:tc>
           <w:tcPr>
             <w:tcW w:type="dxa" w:w="4320"/>
-            <w:vAlign w:val="center"/>
           </w:tcPr>
           <w:p>
             <w:r>
-              <w:t>Topic completion calculation</w:t>
+              <w:t>SCS2104</w:t>
             </w:r>
           </w:p>
         </w:tc>
         <w:tc>
           <w:tcPr>
             <w:tcW w:type="dxa" w:w="4320"/>
-            <w:vAlign w:val="center"/>
           </w:tcPr>
           <w:p>
             <w:r>
-              <w:t>The completed-topic count is divided by the total topic count and converted to a percentage.</w:t>
+              <w:t>Supplies requirements analysis, system boundaries, actors, data flows, documentation and decomposition of the student workflow.</w:t>
             </w:r>
           </w:p>
         </w:tc>
@@ -269,110 +144,31 @@
         <w:tc>
           <w:tcPr>
             <w:tcW w:type="dxa" w:w="4320"/>
-            <w:vAlign w:val="center"/>
           </w:tcPr>
           <w:p>
             <w:r>
-              <w:t>Linear module search</w:t>
+              <w:t>SCS2114</w:t>
             </w:r>
           </w:p>
         </w:tc>
         <w:tc>
           <w:tcPr>
             <w:tcW w:type="dxa" w:w="4320"/>
-            <w:vAlign w:val="center"/>
           </w:tcPr>
           <w:p>
             <w:r>
-              <w:t>The search query is normalized to lowercase and checked against each module's searchable text. This is O(n) for n modules.</w:t>
-            </w:r>
-          </w:p>
-        </w:tc>
-      </w:tr>
-      <w:tr>
-        <w:tc>
-          <w:tcPr>
-            <w:tcW w:type="dxa" w:w="4320"/>
-            <w:vAlign w:val="center"/>
-          </w:tcPr>
-          <w:p>
-            <w:r>
-              <w:t>Record lookup</w:t>
-            </w:r>
-          </w:p>
-        </w:tc>
-        <w:tc>
-          <w:tcPr>
-            <w:tcW w:type="dxa" w:w="4320"/>
-            <w:vAlign w:val="center"/>
-          </w:tcPr>
-          <w:p>
-            <w:r>
-              <w:t>JavaScript object keys and SQLite WHERE queries locate the current user's module record.</w:t>
-            </w:r>
-          </w:p>
-        </w:tc>
-      </w:tr>
-      <w:tr>
-        <w:tc>
-          <w:tcPr>
-            <w:tcW w:type="dxa" w:w="4320"/>
-            <w:vAlign w:val="center"/>
-          </w:tcPr>
-          <w:p>
-            <w:r>
-              <w:t>Input validation and clamping</w:t>
-            </w:r>
-          </w:p>
-        </w:tc>
-        <w:tc>
-          <w:tcPr>
-            <w:tcW w:type="dxa" w:w="4320"/>
-            <w:vAlign w:val="center"/>
-          </w:tcPr>
-          <w:p>
-            <w:r>
-              <w:t>Names, passwords and numeric evidence are checked, and academic values are constrained to valid ranges.</w:t>
-            </w:r>
-          </w:p>
-        </w:tc>
-      </w:tr>
-      <w:tr>
-        <w:tc>
-          <w:tcPr>
-            <w:tcW w:type="dxa" w:w="4320"/>
-            <w:vAlign w:val="center"/>
-          </w:tcPr>
-          <w:p>
-            <w:r>
-              <w:t>Password verification</w:t>
-            </w:r>
-          </w:p>
-        </w:tc>
-        <w:tc>
-          <w:tcPr>
-            <w:tcW w:type="dxa" w:w="4320"/>
-            <w:vAlign w:val="center"/>
-          </w:tcPr>
-          <w:p>
-            <w:r>
-              <w:t>Werkzeug's password hashing and verification functions perform salted password hashing and comparison in the Flask backend.</w:t>
+              <w:t>Supplies responsive HTML/CSS/JavaScript, forms, dynamic interaction, server routes, database connections and deployment.</w:t>
             </w:r>
           </w:p>
         </w:tc>
       </w:tr>
     </w:tbl>
     <w:p>
-      <w:r>
-        <w:t>The main progress algorithm is deterministic. The same evidence produces the same result, while the evidence itself remains specific to the authenticated student.</w:t>
-      </w:r>
-    </w:p>
-    <w:p>
       <w:pPr>
         <w:pStyle w:val="Heading1"/>
       </w:pPr>
       <w:r>
-        <w:t>Data structures implemented</w:t>
+        <w:t>4. How all 16 NUST modules contributed</w:t>
       </w:r>
     </w:p>
     <w:tbl>
@@ -390,28 +186,20 @@
         <w:tc>
           <w:tcPr>
             <w:tcW w:type="dxa" w:w="4320"/>
-            <w:vAlign w:val="center"/>
           </w:tcPr>
           <w:p>
             <w:r>
-              <w:rPr>
-                <w:b/>
-              </w:rPr>
-              <w:t>Data structure</w:t>
+              <w:t>Module</w:t>
             </w:r>
           </w:p>
         </w:tc>
         <w:tc>
           <w:tcPr>
             <w:tcW w:type="dxa" w:w="4320"/>
-            <w:vAlign w:val="center"/>
           </w:tcPr>
           <w:p>
             <w:r>
-              <w:rPr>
-                <w:b/>
-              </w:rPr>
-              <w:t>Use in MyNUST</w:t>
+              <w:t>Contribution</w:t>
             </w:r>
           </w:p>
         </w:tc>
@@ -420,22 +208,20 @@
         <w:tc>
           <w:tcPr>
             <w:tcW w:type="dxa" w:w="4320"/>
-            <w:vAlign w:val="center"/>
           </w:tcPr>
           <w:p>
             <w:r>
-              <w:t>SQLite relational table</w:t>
+              <w:t>SPH1105 Electricity and Magnetism</w:t>
             </w:r>
           </w:p>
         </w:tc>
         <w:tc>
           <w:tcPr>
             <w:tcW w:type="dxa" w:w="4320"/>
-            <w:vAlign w:val="center"/>
           </w:tcPr>
           <w:p>
             <w:r>
-              <w:t>The users table stores id, name, password_hash and created_at with a unique case-insensitive name constraint.</w:t>
+              <w:t>Indirect foundation: systems thinking, measurement and the physical context of computing and networks.</w:t>
             </w:r>
           </w:p>
         </w:tc>
@@ -444,7 +230,754 @@
         <w:tc>
           <w:tcPr>
             <w:tcW w:type="dxa" w:w="4320"/>
-            <w:vAlign w:val="center"/>
+          </w:tcPr>
+          <w:p>
+            <w:r>
+              <w:t>SMA1101 Calculus</w:t>
+            </w:r>
+          </w:p>
+        </w:tc>
+        <w:tc>
+          <w:tcPr>
+            <w:tcW w:type="dxa" w:w="4320"/>
+          </w:tcPr>
+          <w:p>
+            <w:r>
+              <w:t>Indirect foundation: quantitative reasoning and continuous measures; the site does not require a calculus algorithm.</w:t>
+            </w:r>
+          </w:p>
+        </w:tc>
+      </w:tr>
+      <w:tr>
+        <w:tc>
+          <w:tcPr>
+            <w:tcW w:type="dxa" w:w="4320"/>
+          </w:tcPr>
+          <w:p>
+            <w:r>
+              <w:t>SMA1102 Linear Algebra</w:t>
+            </w:r>
+          </w:p>
+        </w:tc>
+        <w:tc>
+          <w:tcPr>
+            <w:tcW w:type="dxa" w:w="4320"/>
+          </w:tcPr>
+          <w:p>
+            <w:r>
+              <w:t>Indirect foundation: structured representation of related values and quantitative reasoning.</w:t>
+            </w:r>
+          </w:p>
+        </w:tc>
+      </w:tr>
+      <w:tr>
+        <w:tc>
+          <w:tcPr>
+            <w:tcW w:type="dxa" w:w="4320"/>
+          </w:tcPr>
+          <w:p>
+            <w:r>
+              <w:t>SCS1101 Introduction to Computer Science and Programming</w:t>
+            </w:r>
+          </w:p>
+        </w:tc>
+        <w:tc>
+          <w:tcPr>
+            <w:tcW w:type="dxa" w:w="4320"/>
+          </w:tcPr>
+          <w:p>
+            <w:r>
+              <w:t>Direct foundation: variables, control flow, programming, data structures, algorithms, databases and networks.</w:t>
+            </w:r>
+          </w:p>
+        </w:tc>
+      </w:tr>
+      <w:tr>
+        <w:tc>
+          <w:tcPr>
+            <w:tcW w:type="dxa" w:w="4320"/>
+          </w:tcPr>
+          <w:p>
+            <w:r>
+              <w:t>SCS1103 Operating Systems</w:t>
+            </w:r>
+          </w:p>
+        </w:tc>
+        <w:tc>
+          <w:tcPr>
+            <w:tcW w:type="dxa" w:w="4320"/>
+          </w:tcPr>
+          <w:p>
+            <w:r>
+              <w:t>Direct foundation: processes, server execution, file paths, sessions, environment variables and resource separation.</w:t>
+            </w:r>
+          </w:p>
+        </w:tc>
+      </w:tr>
+      <w:tr>
+        <w:tc>
+          <w:tcPr>
+            <w:tcW w:type="dxa" w:w="4320"/>
+          </w:tcPr>
+          <w:p>
+            <w:r>
+              <w:t>SCS1111 Principles of Programming Languages</w:t>
+            </w:r>
+          </w:p>
+        </w:tc>
+        <w:tc>
+          <w:tcPr>
+            <w:tcW w:type="dxa" w:w="4320"/>
+          </w:tcPr>
+          <w:p>
+            <w:r>
+              <w:t>Direct foundation: functions, abstraction, objects, event-driven programming and runtime behaviour in Python and JavaScript.</w:t>
+            </w:r>
+          </w:p>
+        </w:tc>
+      </w:tr>
+      <w:tr>
+        <w:tc>
+          <w:tcPr>
+            <w:tcW w:type="dxa" w:w="4320"/>
+          </w:tcPr>
+          <w:p>
+            <w:r>
+              <w:t>SCS1112 Fundamentals of Digital Electronics</w:t>
+            </w:r>
+          </w:p>
+        </w:tc>
+        <w:tc>
+          <w:tcPr>
+            <w:tcW w:type="dxa" w:w="4320"/>
+          </w:tcPr>
+          <w:p>
+            <w:r>
+              <w:t>Indirect foundation: Boolean state, flags, checkboxes and digital input representation.</w:t>
+            </w:r>
+          </w:p>
+        </w:tc>
+      </w:tr>
+      <w:tr>
+        <w:tc>
+          <w:tcPr>
+            <w:tcW w:type="dxa" w:w="4320"/>
+          </w:tcPr>
+          <w:p>
+            <w:r>
+              <w:t>SCS1211 Computer Architecture and Organization</w:t>
+            </w:r>
+          </w:p>
+        </w:tc>
+        <w:tc>
+          <w:tcPr>
+            <w:tcW w:type="dxa" w:w="4320"/>
+          </w:tcPr>
+          <w:p>
+            <w:r>
+              <w:t>Indirect foundation: client/server, input/output, memory and storage decisions.</w:t>
+            </w:r>
+          </w:p>
+        </w:tc>
+      </w:tr>
+      <w:tr>
+        <w:tc>
+          <w:tcPr>
+            <w:tcW w:type="dxa" w:w="4320"/>
+          </w:tcPr>
+          <w:p>
+            <w:r>
+              <w:t>SCS1212 Data Structures and Algorithms</w:t>
+            </w:r>
+          </w:p>
+        </w:tc>
+        <w:tc>
+          <w:tcPr>
+            <w:tcW w:type="dxa" w:w="4320"/>
+          </w:tcPr>
+          <w:p>
+            <w:r>
+              <w:t>Direct foundation: arrays, objects/maps, filtering, lookup, aggregation and complexity.</w:t>
+            </w:r>
+          </w:p>
+        </w:tc>
+      </w:tr>
+      <w:tr>
+        <w:tc>
+          <w:tcPr>
+            <w:tcW w:type="dxa" w:w="4320"/>
+          </w:tcPr>
+          <w:p>
+            <w:r>
+              <w:t>SCS1213 Database Systems</w:t>
+            </w:r>
+          </w:p>
+        </w:tc>
+        <w:tc>
+          <w:tcPr>
+            <w:tcW w:type="dxa" w:w="4320"/>
+          </w:tcPr>
+          <w:p>
+            <w:r>
+              <w:t>Direct foundation: SQLite schema, SQL queries, uniqueness constraints, upsert records and persistence.</w:t>
+            </w:r>
+          </w:p>
+        </w:tc>
+      </w:tr>
+      <w:tr>
+        <w:tc>
+          <w:tcPr>
+            <w:tcW w:type="dxa" w:w="4320"/>
+          </w:tcPr>
+          <w:p>
+            <w:r>
+              <w:t>SCS1214 Software Engineering</w:t>
+            </w:r>
+          </w:p>
+        </w:tc>
+        <w:tc>
+          <w:tcPr>
+            <w:tcW w:type="dxa" w:w="4320"/>
+          </w:tcPr>
+          <w:p>
+            <w:r>
+              <w:t>Direct foundation: requirements, modular design, testing, documentation, version control, deployment and maintenance.</w:t>
+            </w:r>
+          </w:p>
+        </w:tc>
+      </w:tr>
+      <w:tr>
+        <w:tc>
+          <w:tcPr>
+            <w:tcW w:type="dxa" w:w="4320"/>
+          </w:tcPr>
+          <w:p>
+            <w:r>
+              <w:t>SCS1210 Discrete Mathematics</w:t>
+            </w:r>
+          </w:p>
+        </w:tc>
+        <w:tc>
+          <w:tcPr>
+            <w:tcW w:type="dxa" w:w="4320"/>
+          </w:tcPr>
+          <w:p>
+            <w:r>
+              <w:t>Direct foundation: sets, predicates, relations, finite collections, validation and weighted finite calculations.</w:t>
+            </w:r>
+          </w:p>
+        </w:tc>
+      </w:tr>
+      <w:tr>
+        <w:tc>
+          <w:tcPr>
+            <w:tcW w:type="dxa" w:w="4320"/>
+          </w:tcPr>
+          <w:p>
+            <w:r>
+              <w:t>SCS1215 Ethics and Professionalism</w:t>
+            </w:r>
+          </w:p>
+        </w:tc>
+        <w:tc>
+          <w:tcPr>
+            <w:tcW w:type="dxa" w:w="4320"/>
+          </w:tcPr>
+          <w:p>
+            <w:r>
+              <w:t>Direct foundation: privacy, password handling, limitations, responsible data use and professional communication.</w:t>
+            </w:r>
+          </w:p>
+        </w:tc>
+      </w:tr>
+      <w:tr>
+        <w:tc>
+          <w:tcPr>
+            <w:tcW w:type="dxa" w:w="4320"/>
+          </w:tcPr>
+          <w:p>
+            <w:r>
+              <w:t>SORS2107 Applied Statistics for Computing</w:t>
+            </w:r>
+          </w:p>
+        </w:tc>
+        <w:tc>
+          <w:tcPr>
+            <w:tcW w:type="dxa" w:w="4320"/>
+          </w:tcPr>
+          <w:p>
+            <w:r>
+              <w:t>Direct current module: marks, attendance, quiz averages, assignment counts and weighted progress.</w:t>
+            </w:r>
+          </w:p>
+        </w:tc>
+      </w:tr>
+      <w:tr>
+        <w:tc>
+          <w:tcPr>
+            <w:tcW w:type="dxa" w:w="4320"/>
+          </w:tcPr>
+          <w:p>
+            <w:r>
+              <w:t>SCS2104 Structured System Analysis and Design</w:t>
+            </w:r>
+          </w:p>
+        </w:tc>
+        <w:tc>
+          <w:tcPr>
+            <w:tcW w:type="dxa" w:w="4320"/>
+          </w:tcPr>
+          <w:p>
+            <w:r>
+              <w:t>Direct current module: requirements, workflows, system actors, module decomposition and documentation.</w:t>
+            </w:r>
+          </w:p>
+        </w:tc>
+      </w:tr>
+      <w:tr>
+        <w:tc>
+          <w:tcPr>
+            <w:tcW w:type="dxa" w:w="4320"/>
+          </w:tcPr>
+          <w:p>
+            <w:r>
+              <w:t>SCS2114 Web Development</w:t>
+            </w:r>
+          </w:p>
+        </w:tc>
+        <w:tc>
+          <w:tcPr>
+            <w:tcW w:type="dxa" w:w="4320"/>
+          </w:tcPr>
+          <w:p>
+            <w:r>
+              <w:t>Direct current module: the complete web implementation, interaction model, frontend/backend connection and deployment.</w:t>
+            </w:r>
+          </w:p>
+        </w:tc>
+      </w:tr>
+    </w:tbl>
+    <w:p>
+      <w:pPr>
+        <w:pStyle w:val="Heading1"/>
+      </w:pPr>
+      <w:r>
+        <w:t>5. System architecture</w:t>
+      </w:r>
+    </w:p>
+    <w:p>
+      <w:r>
+        <w:t>The frontend is a single responsive HTML document with CSS and JavaScript. HTML provides semantic sections, forms, module cards, library rows and accessible labels. CSS provides the NUST-inspired visual system, responsive grid changes, mobile navigation, scrollable module dialogs and touch-friendly input controls. JavaScript manages authentication mode, module selection, search, dynamic module insertion, checklists, notes, evidence inputs, progress calculation and local storage.</w:t>
+      </w:r>
+    </w:p>
+    <w:p>
+      <w:r>
+        <w:t>The Flask backend serves index.html and static assets, exposes authentication routes, creates the SQLite schema, verifies password hashes, creates sessions and stores authenticated study records. The backend is intentionally small so the ownership of each behaviour is easy to explain in an SCS2114 assessment.</w:t>
+      </w:r>
+    </w:p>
+    <w:tbl>
+      <w:tblPr>
+        <w:tblStyle w:val="TableGrid"/>
+        <w:tblW w:type="auto" w:w="0"/>
+        <w:jc w:val="center"/>
+        <w:tblLook w:firstColumn="1" w:firstRow="1" w:lastColumn="0" w:lastRow="0" w:noHBand="0" w:noVBand="1" w:val="04A0"/>
+      </w:tblPr>
+      <w:tblGrid>
+        <w:gridCol w:w="4320"/>
+        <w:gridCol w:w="4320"/>
+      </w:tblGrid>
+      <w:tr>
+        <w:tc>
+          <w:tcPr>
+            <w:tcW w:type="dxa" w:w="4320"/>
+          </w:tcPr>
+          <w:p>
+            <w:r>
+              <w:t>Layer</w:t>
+            </w:r>
+          </w:p>
+        </w:tc>
+        <w:tc>
+          <w:tcPr>
+            <w:tcW w:type="dxa" w:w="4320"/>
+          </w:tcPr>
+          <w:p>
+            <w:r>
+              <w:t>Implementation</w:t>
+            </w:r>
+          </w:p>
+        </w:tc>
+      </w:tr>
+      <w:tr>
+        <w:tc>
+          <w:tcPr>
+            <w:tcW w:type="dxa" w:w="4320"/>
+          </w:tcPr>
+          <w:p>
+            <w:r>
+              <w:t>Presentation</w:t>
+            </w:r>
+          </w:p>
+        </w:tc>
+        <w:tc>
+          <w:tcPr>
+            <w:tcW w:type="dxa" w:w="4320"/>
+          </w:tcPr>
+          <w:p>
+            <w:r>
+              <w:t>HTML, CSS, responsive grid, NUST crest and official NUST campus image.</w:t>
+            </w:r>
+          </w:p>
+        </w:tc>
+      </w:tr>
+      <w:tr>
+        <w:tc>
+          <w:tcPr>
+            <w:tcW w:type="dxa" w:w="4320"/>
+          </w:tcPr>
+          <w:p>
+            <w:r>
+              <w:t>Client behaviour</w:t>
+            </w:r>
+          </w:p>
+        </w:tc>
+        <w:tc>
+          <w:tcPr>
+            <w:tcW w:type="dxa" w:w="4320"/>
+          </w:tcPr>
+          <w:p>
+            <w:r>
+              <w:t>JavaScript event handlers, module modal, search, module picker, local storage and calculated progress.</w:t>
+            </w:r>
+          </w:p>
+        </w:tc>
+      </w:tr>
+      <w:tr>
+        <w:tc>
+          <w:tcPr>
+            <w:tcW w:type="dxa" w:w="4320"/>
+          </w:tcPr>
+          <w:p>
+            <w:r>
+              <w:t>Application server</w:t>
+            </w:r>
+          </w:p>
+        </w:tc>
+        <w:tc>
+          <w:tcPr>
+            <w:tcW w:type="dxa" w:w="4320"/>
+          </w:tcPr>
+          <w:p>
+            <w:r>
+              <w:t>Flask routes for registration, login, session, module catalog and study records.</w:t>
+            </w:r>
+          </w:p>
+        </w:tc>
+      </w:tr>
+      <w:tr>
+        <w:tc>
+          <w:tcPr>
+            <w:tcW w:type="dxa" w:w="4320"/>
+          </w:tcPr>
+          <w:p>
+            <w:r>
+              <w:t>Persistence</w:t>
+            </w:r>
+          </w:p>
+        </w:tc>
+        <w:tc>
+          <w:tcPr>
+            <w:tcW w:type="dxa" w:w="4320"/>
+          </w:tcPr>
+          <w:p>
+            <w:r>
+              <w:t>SQLite users and study_records tables; Werkzeug password hashes; HTTP-only session cookies.</w:t>
+            </w:r>
+          </w:p>
+        </w:tc>
+      </w:tr>
+      <w:tr>
+        <w:tc>
+          <w:tcPr>
+            <w:tcW w:type="dxa" w:w="4320"/>
+          </w:tcPr>
+          <w:p>
+            <w:r>
+              <w:t>Deployment</w:t>
+            </w:r>
+          </w:p>
+        </w:tc>
+        <w:tc>
+          <w:tcPr>
+            <w:tcW w:type="dxa" w:w="4320"/>
+          </w:tcPr>
+          <w:p>
+            <w:r>
+              <w:t>GitHub Pages for static demonstration; Flask-capable hosting required for server authentication.</w:t>
+            </w:r>
+          </w:p>
+        </w:tc>
+      </w:tr>
+    </w:tbl>
+    <w:p>
+      <w:pPr>
+        <w:pStyle w:val="Heading1"/>
+      </w:pPr>
+      <w:r>
+        <w:t>6. Progress model</w:t>
+      </w:r>
+    </w:p>
+    <w:p>
+      <w:r>
+        <w:t>Progress is not a hard-coded value and is not shared between students. Each student has a record for each module. The calculated result is: progress = topic completion x 0.25 + assignment percentage x 0.20 + quiz average x 0.20 + attendance x 0.15 + exam mark x 0.20.</w:t>
+      </w:r>
+    </w:p>
+    <w:p>
+      <w:r>
+        <w:t>Topic completion is calculated as completed topics divided by total topics multiplied by 100. Assignment percentage is submitted assignments divided by 10 multiplied by 100. Quiz, attendance and exam inputs are constrained to 0-100. The final result is rounded to the nearest whole percentage. The same deterministic formula is applied to each student, but the inputs belong to that student.</w:t>
+      </w:r>
+    </w:p>
+    <w:p>
+      <w:pPr>
+        <w:pStyle w:val="Heading1"/>
+      </w:pPr>
+      <w:r>
+        <w:t>7. Algorithms</w:t>
+      </w:r>
+    </w:p>
+    <w:tbl>
+      <w:tblPr>
+        <w:tblStyle w:val="TableGrid"/>
+        <w:tblW w:type="auto" w:w="0"/>
+        <w:jc w:val="center"/>
+        <w:tblLook w:firstColumn="1" w:firstRow="1" w:lastColumn="0" w:lastRow="0" w:noHBand="0" w:noVBand="1" w:val="04A0"/>
+      </w:tblPr>
+      <w:tblGrid>
+        <w:gridCol w:w="4320"/>
+        <w:gridCol w:w="4320"/>
+      </w:tblGrid>
+      <w:tr>
+        <w:tc>
+          <w:tcPr>
+            <w:tcW w:type="dxa" w:w="4320"/>
+          </w:tcPr>
+          <w:p>
+            <w:r>
+              <w:t>Algorithm</w:t>
+            </w:r>
+          </w:p>
+        </w:tc>
+        <w:tc>
+          <w:tcPr>
+            <w:tcW w:type="dxa" w:w="4320"/>
+          </w:tcPr>
+          <w:p>
+            <w:r>
+              <w:t>Explanation and complexity</w:t>
+            </w:r>
+          </w:p>
+        </w:tc>
+      </w:tr>
+      <w:tr>
+        <w:tc>
+          <w:tcPr>
+            <w:tcW w:type="dxa" w:w="4320"/>
+          </w:tcPr>
+          <w:p>
+            <w:r>
+              <w:t>Weighted aggregation</w:t>
+            </w:r>
+          </w:p>
+        </w:tc>
+        <w:tc>
+          <w:tcPr>
+            <w:tcW w:type="dxa" w:w="4320"/>
+          </w:tcPr>
+          <w:p>
+            <w:r>
+              <w:t>Combines five validated evidence values using fixed weights. O(1).</w:t>
+            </w:r>
+          </w:p>
+        </w:tc>
+      </w:tr>
+      <w:tr>
+        <w:tc>
+          <w:tcPr>
+            <w:tcW w:type="dxa" w:w="4320"/>
+          </w:tcPr>
+          <w:p>
+            <w:r>
+              <w:t>Topic completion</w:t>
+            </w:r>
+          </w:p>
+        </w:tc>
+        <w:tc>
+          <w:tcPr>
+            <w:tcW w:type="dxa" w:w="4320"/>
+          </w:tcPr>
+          <w:p>
+            <w:r>
+              <w:t>Counts selected topic indexes and divides by the module topic count. O(t), where t is topics.</w:t>
+            </w:r>
+          </w:p>
+        </w:tc>
+      </w:tr>
+      <w:tr>
+        <w:tc>
+          <w:tcPr>
+            <w:tcW w:type="dxa" w:w="4320"/>
+          </w:tcPr>
+          <w:p>
+            <w:r>
+              <w:t>Linear search</w:t>
+            </w:r>
+          </w:p>
+        </w:tc>
+        <w:tc>
+          <w:tcPr>
+            <w:tcW w:type="dxa" w:w="4320"/>
+          </w:tcPr>
+          <w:p>
+            <w:r>
+              <w:t>Normalises the search text and checks each module search string. O(n) for n visible modules.</w:t>
+            </w:r>
+          </w:p>
+        </w:tc>
+      </w:tr>
+      <w:tr>
+        <w:tc>
+          <w:tcPr>
+            <w:tcW w:type="dxa" w:w="4320"/>
+          </w:tcPr>
+          <w:p>
+            <w:r>
+              <w:t>Key lookup</w:t>
+            </w:r>
+          </w:p>
+        </w:tc>
+        <w:tc>
+          <w:tcPr>
+            <w:tcW w:type="dxa" w:w="4320"/>
+          </w:tcPr>
+          <w:p>
+            <w:r>
+              <w:t>Uses module codes as object keys for fast access to metadata and records. Average O(1).</w:t>
+            </w:r>
+          </w:p>
+        </w:tc>
+      </w:tr>
+      <w:tr>
+        <w:tc>
+          <w:tcPr>
+            <w:tcW w:type="dxa" w:w="4320"/>
+          </w:tcPr>
+          <w:p>
+            <w:r>
+              <w:t>Input validation</w:t>
+            </w:r>
+          </w:p>
+        </w:tc>
+        <w:tc>
+          <w:tcPr>
+            <w:tcW w:type="dxa" w:w="4320"/>
+          </w:tcPr>
+          <w:p>
+            <w:r>
+              <w:t>Checks required strings, password length and numeric bounds before storage.</w:t>
+            </w:r>
+          </w:p>
+        </w:tc>
+      </w:tr>
+      <w:tr>
+        <w:tc>
+          <w:tcPr>
+            <w:tcW w:type="dxa" w:w="4320"/>
+          </w:tcPr>
+          <w:p>
+            <w:r>
+              <w:t>Password verification</w:t>
+            </w:r>
+          </w:p>
+        </w:tc>
+        <w:tc>
+          <w:tcPr>
+            <w:tcW w:type="dxa" w:w="4320"/>
+          </w:tcPr>
+          <w:p>
+            <w:r>
+              <w:t>Werkzeug compares a submitted password with a salted stored hash.</w:t>
+            </w:r>
+          </w:p>
+        </w:tc>
+      </w:tr>
+    </w:tbl>
+    <w:p>
+      <w:pPr>
+        <w:pStyle w:val="Heading1"/>
+      </w:pPr>
+      <w:r>
+        <w:t>8. Data structures</w:t>
+      </w:r>
+    </w:p>
+    <w:tbl>
+      <w:tblPr>
+        <w:tblStyle w:val="TableGrid"/>
+        <w:tblW w:type="auto" w:w="0"/>
+        <w:jc w:val="center"/>
+        <w:tblLook w:firstColumn="1" w:firstRow="1" w:lastColumn="0" w:lastRow="0" w:noHBand="0" w:noVBand="1" w:val="04A0"/>
+      </w:tblPr>
+      <w:tblGrid>
+        <w:gridCol w:w="4320"/>
+        <w:gridCol w:w="4320"/>
+      </w:tblGrid>
+      <w:tr>
+        <w:tc>
+          <w:tcPr>
+            <w:tcW w:type="dxa" w:w="4320"/>
+          </w:tcPr>
+          <w:p>
+            <w:r>
+              <w:t>Structure</w:t>
+            </w:r>
+          </w:p>
+        </w:tc>
+        <w:tc>
+          <w:tcPr>
+            <w:tcW w:type="dxa" w:w="4320"/>
+          </w:tcPr>
+          <w:p>
+            <w:r>
+              <w:t>Use</w:t>
+            </w:r>
+          </w:p>
+        </w:tc>
+      </w:tr>
+      <w:tr>
+        <w:tc>
+          <w:tcPr>
+            <w:tcW w:type="dxa" w:w="4320"/>
+          </w:tcPr>
+          <w:p>
+            <w:r>
+              <w:t>SQLite relational tables</w:t>
+            </w:r>
+          </w:p>
+        </w:tc>
+        <w:tc>
+          <w:tcPr>
+            <w:tcW w:type="dxa" w:w="4320"/>
+          </w:tcPr>
+          <w:p>
+            <w:r>
+              <w:t>Users and per-user study_records with a unique user/module pair.</w:t>
+            </w:r>
+          </w:p>
+        </w:tc>
+      </w:tr>
+      <w:tr>
+        <w:tc>
+          <w:tcPr>
+            <w:tcW w:type="dxa" w:w="4320"/>
           </w:tcPr>
           <w:p>
             <w:r>
@@ -455,11 +988,10 @@
         <w:tc>
           <w:tcPr>
             <w:tcW w:type="dxa" w:w="4320"/>
-            <w:vAlign w:val="center"/>
           </w:tcPr>
           <w:p>
             <w:r>
-              <w:t>moduleDetails maps module codes to titles, descriptions and topics; per-user records map module codes to study evidence.</w:t>
+              <w:t>Module metadata and each student’s evidence record.</w:t>
             </w:r>
           </w:p>
         </w:tc>
@@ -468,7 +1000,6 @@
         <w:tc>
           <w:tcPr>
             <w:tcW w:type="dxa" w:w="4320"/>
-            <w:vAlign w:val="center"/>
           </w:tcPr>
           <w:p>
             <w:r>
@@ -479,11 +1010,10 @@
         <w:tc>
           <w:tcPr>
             <w:tcW w:type="dxa" w:w="4320"/>
-            <w:vAlign w:val="center"/>
           </w:tcPr>
           <w:p>
             <w:r>
-              <w:t>Topic lists, completed topic indexes, module rows and selected checkboxes are processed as arrays.</w:t>
+              <w:t>Topic lists, completed topic indexes and selected modules.</w:t>
             </w:r>
           </w:p>
         </w:tc>
@@ -492,22 +1022,20 @@
         <w:tc>
           <w:tcPr>
             <w:tcW w:type="dxa" w:w="4320"/>
-            <w:vAlign w:val="center"/>
           </w:tcPr>
           <w:p>
             <w:r>
-              <w:t>JSON objects</w:t>
+              <w:t>JSON</w:t>
             </w:r>
           </w:p>
         </w:tc>
         <w:tc>
           <w:tcPr>
             <w:tcW w:type="dxa" w:w="4320"/>
-            <w:vAlign w:val="center"/>
           </w:tcPr>
           <w:p>
             <w:r>
-              <w:t>Browser fallback records and HTTP request/response bodies use JSON structures.</w:t>
+              <w:t>HTTP request bodies, browser storage records and API responses.</w:t>
             </w:r>
           </w:p>
         </w:tc>
@@ -516,7 +1044,6 @@
         <w:tc>
           <w:tcPr>
             <w:tcW w:type="dxa" w:w="4320"/>
-            <w:vAlign w:val="center"/>
           </w:tcPr>
           <w:p>
             <w:r>
@@ -527,11 +1054,10 @@
         <w:tc>
           <w:tcPr>
             <w:tcW w:type="dxa" w:w="4320"/>
-            <w:vAlign w:val="center"/>
           </w:tcPr>
           <w:p>
             <w:r>
-              <w:t>The browser DOM represents the interface; querySelectorAll returns collections used for filtering and event binding.</w:t>
+              <w:t>Module cards, form controls and topic checkboxes in the browser.</w:t>
             </w:r>
           </w:p>
         </w:tc>
@@ -540,22 +1066,20 @@
         <w:tc>
           <w:tcPr>
             <w:tcW w:type="dxa" w:w="4320"/>
-            <w:vAlign w:val="center"/>
           </w:tcPr>
           <w:p>
             <w:r>
-              <w:t>Session dictionary</w:t>
+              <w:t>Flask session dictionary</w:t>
             </w:r>
           </w:p>
         </w:tc>
         <w:tc>
           <w:tcPr>
             <w:tcW w:type="dxa" w:w="4320"/>
-            <w:vAlign w:val="center"/>
           </w:tcPr>
           <w:p>
             <w:r>
-              <w:t>Flask sessions hold the authenticated user id and user name in a signed server-side session cookie.</w:t>
+              <w:t>Authenticated user id and user name for the current session.</w:t>
             </w:r>
           </w:p>
         </w:tc>
@@ -566,12 +1090,12 @@
         <w:pStyle w:val="Heading1"/>
       </w:pPr>
       <w:r>
-        <w:t>Security and ethics</w:t>
+        <w:t>9. Security, privacy and ethics</w:t>
       </w:r>
     </w:p>
     <w:p>
       <w:r>
-        <w:t>The Flask backend validates names and password length, hashes passwords instead of storing plain text, uses parameterized SQL queries, clears and sets authenticated sessions, and marks cookies HTTP-only. The GitHub Pages demonstration has a browser-local fallback because static hosting cannot execute Python. It should be described as a demonstration mode, not as a replacement for a production university authentication service.</w:t>
+        <w:t>The backend does not store plain-text passwords. It uses Werkzeug password hashing, parameterised SQL statements and HTTP-only cookies. Input values are validated and bounded. The project also states its limitations: self-entered attendance and marks are not official academic results. A production version would require university identity integration, lecturer roles, verified records, password reset, HTTPS, backups, audit logs and a managed database.</w:t>
       </w:r>
     </w:p>
     <w:p>
@@ -579,12 +1103,71 @@
         <w:pStyle w:val="Heading1"/>
       </w:pPr>
       <w:r>
-        <w:t>Limitations and future work</w:t>
+        <w:t>10. Testing and evidence</w:t>
       </w:r>
     </w:p>
     <w:p>
+      <w:pPr>
+        <w:pStyle w:val="ListBullet"/>
+      </w:pPr>
       <w:r>
-        <w:t>The current prototype accepts academic evidence as input rather than receiving it from official assignment, quiz, attendance and examination systems. A production system would add lecturer and administrator roles, verified submissions, automatic quiz results, attendance integration, official marks, email verification, password reset, a managed database, backups and audit logs.</w:t>
+        <w:t>Registration and login were tested with valid and invalid credentials.</w:t>
+      </w:r>
+    </w:p>
+    <w:p>
+      <w:pPr>
+        <w:pStyle w:val="ListBullet"/>
+      </w:pPr>
+      <w:r>
+        <w:t>Wrong passwords return an error and do not open the workspace.</w:t>
+      </w:r>
+    </w:p>
+    <w:p>
+      <w:pPr>
+        <w:pStyle w:val="ListBullet"/>
+      </w:pPr>
+      <w:r>
+        <w:t>Module dialogs open for current and added subjects.</w:t>
+      </w:r>
+    </w:p>
+    <w:p>
+      <w:pPr>
+        <w:pStyle w:val="ListBullet"/>
+      </w:pPr>
+      <w:r>
+        <w:t>Definitions, formulas, checklists, notes and academic evidence persist per student.</w:t>
+      </w:r>
+    </w:p>
+    <w:p>
+      <w:pPr>
+        <w:pStyle w:val="ListBullet"/>
+      </w:pPr>
+      <w:r>
+        <w:t>A sample calculation of 66% was verified from topics, assignments, quiz, attendance and exam values.</w:t>
+      </w:r>
+    </w:p>
+    <w:p>
+      <w:pPr>
+        <w:pStyle w:val="ListBullet"/>
+      </w:pPr>
+      <w:r>
+        <w:t>The module picker adds a remaining subject without changing another student’s library.</w:t>
+      </w:r>
+    </w:p>
+    <w:p>
+      <w:pPr>
+        <w:pStyle w:val="ListBullet"/>
+      </w:pPr>
+      <w:r>
+        <w:t>Mobile testing confirmed the dialog is scrollable and the page has no horizontal overflow at a 390px viewport.</w:t>
+      </w:r>
+    </w:p>
+    <w:p>
+      <w:pPr>
+        <w:pStyle w:val="ListBullet"/>
+      </w:pPr>
+      <w:r>
+        <w:t>Python syntax, Flask routes and the Word documents were validated.</w:t>
       </w:r>
     </w:p>
     <w:p>
@@ -592,822 +1175,27 @@
         <w:pStyle w:val="Heading1"/>
       </w:pPr>
       <w:r>
-        <w:t>Use of the 16 university modules</w:t>
+        <w:t>11. Limitations and future development</w:t>
       </w:r>
     </w:p>
     <w:p>
       <w:r>
-        <w:t>All 16 modules informed the project, but they were not all used as direct coding dependencies. This distinction is important. Eight modules contribute directly to the implementation and eight contribute indirectly through mathematical, systems or professional foundations.</w:t>
+        <w:t>The GitHub Pages link is a static demonstration. It cannot run Flask or SQLite, so browser-local storage is used there. The local/Flask version provides the real backend routes. Future versions should use a production database, lecturer dashboards, verified marks, assignment upload, quiz integration, attendance integration, notifications, password reset and official NUST service integration.</w:t>
       </w:r>
     </w:p>
-    <w:tbl>
-      <w:tblPr>
-        <w:tblStyle w:val="TableGrid"/>
-        <w:tblW w:type="auto" w:w="0"/>
-        <w:jc w:val="center"/>
-        <w:tblLook w:firstColumn="1" w:firstRow="1" w:lastColumn="0" w:lastRow="0" w:noHBand="0" w:noVBand="1" w:val="04A0"/>
-      </w:tblPr>
-      <w:tblGrid>
-        <w:gridCol w:w="2160"/>
-        <w:gridCol w:w="2160"/>
-        <w:gridCol w:w="2160"/>
-        <w:gridCol w:w="2160"/>
-      </w:tblGrid>
-      <w:tr>
-        <w:tc>
-          <w:tcPr>
-            <w:tcW w:type="dxa" w:w="2160"/>
-            <w:vAlign w:val="center"/>
-          </w:tcPr>
-          <w:p>
-            <w:r>
-              <w:rPr>
-                <w:b/>
-              </w:rPr>
-              <w:t>Code</w:t>
-            </w:r>
-          </w:p>
-        </w:tc>
-        <w:tc>
-          <w:tcPr>
-            <w:tcW w:type="dxa" w:w="2160"/>
-            <w:vAlign w:val="center"/>
-          </w:tcPr>
-          <w:p>
-            <w:r>
-              <w:rPr>
-                <w:b/>
-              </w:rPr>
-              <w:t>Module</w:t>
-            </w:r>
-          </w:p>
-        </w:tc>
-        <w:tc>
-          <w:tcPr>
-            <w:tcW w:type="dxa" w:w="2160"/>
-            <w:vAlign w:val="center"/>
-          </w:tcPr>
-          <w:p>
-            <w:r>
-              <w:rPr>
-                <w:b/>
-              </w:rPr>
-              <w:t>Use</w:t>
-            </w:r>
-          </w:p>
-        </w:tc>
-        <w:tc>
-          <w:tcPr>
-            <w:tcW w:type="dxa" w:w="2160"/>
-            <w:vAlign w:val="center"/>
-          </w:tcPr>
-          <w:p>
-            <w:r>
-              <w:rPr>
-                <w:b/>
-              </w:rPr>
-              <w:t>Contribution</w:t>
-            </w:r>
-          </w:p>
-        </w:tc>
-      </w:tr>
-      <w:tr>
-        <w:tc>
-          <w:tcPr>
-            <w:tcW w:type="dxa" w:w="2160"/>
-            <w:vAlign w:val="center"/>
-          </w:tcPr>
-          <w:p>
-            <w:r>
-              <w:t>SPH1105</w:t>
-            </w:r>
-          </w:p>
-        </w:tc>
-        <w:tc>
-          <w:tcPr>
-            <w:tcW w:type="dxa" w:w="2160"/>
-            <w:vAlign w:val="center"/>
-          </w:tcPr>
-          <w:p>
-            <w:r>
-              <w:t>Electricity and Magnetism</w:t>
-            </w:r>
-          </w:p>
-        </w:tc>
-        <w:tc>
-          <w:tcPr>
-            <w:tcW w:type="dxa" w:w="2160"/>
-            <w:vAlign w:val="center"/>
-          </w:tcPr>
-          <w:p>
-            <w:r>
-              <w:t>Indirect</w:t>
-            </w:r>
-          </w:p>
-        </w:tc>
-        <w:tc>
-          <w:tcPr>
-            <w:tcW w:type="dxa" w:w="2160"/>
-            <w:vAlign w:val="center"/>
-          </w:tcPr>
-          <w:p>
-            <w:r>
-              <w:t>Systems thinking and the physical technology context of computers and networks. It is not a core software dependency.</w:t>
-            </w:r>
-          </w:p>
-        </w:tc>
-      </w:tr>
-      <w:tr>
-        <w:tc>
-          <w:tcPr>
-            <w:tcW w:type="dxa" w:w="2160"/>
-            <w:vAlign w:val="center"/>
-          </w:tcPr>
-          <w:p>
-            <w:r>
-              <w:t>SMA1101</w:t>
-            </w:r>
-          </w:p>
-        </w:tc>
-        <w:tc>
-          <w:tcPr>
-            <w:tcW w:type="dxa" w:w="2160"/>
-            <w:vAlign w:val="center"/>
-          </w:tcPr>
-          <w:p>
-            <w:r>
-              <w:t>Calculus</w:t>
-            </w:r>
-          </w:p>
-        </w:tc>
-        <w:tc>
-          <w:tcPr>
-            <w:tcW w:type="dxa" w:w="2160"/>
-            <w:vAlign w:val="center"/>
-          </w:tcPr>
-          <w:p>
-            <w:r>
-              <w:t>Indirect</w:t>
-            </w:r>
-          </w:p>
-        </w:tc>
-        <w:tc>
-          <w:tcPr>
-            <w:tcW w:type="dxa" w:w="2160"/>
-            <w:vAlign w:val="center"/>
-          </w:tcPr>
-          <w:p>
-            <w:r>
-              <w:t>Mathematical reasoning used when thinking about continuous measures and progress percentages. No calculus routine is required by the application.</w:t>
-            </w:r>
-          </w:p>
-        </w:tc>
-      </w:tr>
-      <w:tr>
-        <w:tc>
-          <w:tcPr>
-            <w:tcW w:type="dxa" w:w="2160"/>
-            <w:vAlign w:val="center"/>
-          </w:tcPr>
-          <w:p>
-            <w:r>
-              <w:t>SMA1102</w:t>
-            </w:r>
-          </w:p>
-        </w:tc>
-        <w:tc>
-          <w:tcPr>
-            <w:tcW w:type="dxa" w:w="2160"/>
-            <w:vAlign w:val="center"/>
-          </w:tcPr>
-          <w:p>
-            <w:r>
-              <w:t>Linear Algebra</w:t>
-            </w:r>
-          </w:p>
-        </w:tc>
-        <w:tc>
-          <w:tcPr>
-            <w:tcW w:type="dxa" w:w="2160"/>
-            <w:vAlign w:val="center"/>
-          </w:tcPr>
-          <w:p>
-            <w:r>
-              <w:t>Indirect</w:t>
-            </w:r>
-          </w:p>
-        </w:tc>
-        <w:tc>
-          <w:tcPr>
-            <w:tcW w:type="dxa" w:w="2160"/>
-            <w:vAlign w:val="center"/>
-          </w:tcPr>
-          <w:p>
-            <w:r>
-              <w:t>Structured quantitative thinking and representation of related values. No matrix algorithm is part of the current application.</w:t>
-            </w:r>
-          </w:p>
-        </w:tc>
-      </w:tr>
-      <w:tr>
-        <w:tc>
-          <w:tcPr>
-            <w:tcW w:type="dxa" w:w="2160"/>
-            <w:vAlign w:val="center"/>
-          </w:tcPr>
-          <w:p>
-            <w:r>
-              <w:t>SCS1101</w:t>
-            </w:r>
-          </w:p>
-        </w:tc>
-        <w:tc>
-          <w:tcPr>
-            <w:tcW w:type="dxa" w:w="2160"/>
-            <w:vAlign w:val="center"/>
-          </w:tcPr>
-          <w:p>
-            <w:r>
-              <w:t>Introduction to Computer Science and Programming</w:t>
-            </w:r>
-          </w:p>
-        </w:tc>
-        <w:tc>
-          <w:tcPr>
-            <w:tcW w:type="dxa" w:w="2160"/>
-            <w:vAlign w:val="center"/>
-          </w:tcPr>
-          <w:p>
-            <w:r>
-              <w:t>Direct</w:t>
-            </w:r>
-          </w:p>
-        </w:tc>
-        <w:tc>
-          <w:tcPr>
-            <w:tcW w:type="dxa" w:w="2160"/>
-            <w:vAlign w:val="center"/>
-          </w:tcPr>
-          <w:p>
-            <w:r>
-              <w:t>HTML, CSS, JavaScript, variables, control flow, data structures, files, algorithms and database concepts.</w:t>
-            </w:r>
-          </w:p>
-        </w:tc>
-      </w:tr>
-      <w:tr>
-        <w:tc>
-          <w:tcPr>
-            <w:tcW w:type="dxa" w:w="2160"/>
-            <w:vAlign w:val="center"/>
-          </w:tcPr>
-          <w:p>
-            <w:r>
-              <w:t>SCS1103</w:t>
-            </w:r>
-          </w:p>
-        </w:tc>
-        <w:tc>
-          <w:tcPr>
-            <w:tcW w:type="dxa" w:w="2160"/>
-            <w:vAlign w:val="center"/>
-          </w:tcPr>
-          <w:p>
-            <w:r>
-              <w:t>Operating Systems</w:t>
-            </w:r>
-          </w:p>
-        </w:tc>
-        <w:tc>
-          <w:tcPr>
-            <w:tcW w:type="dxa" w:w="2160"/>
-            <w:vAlign w:val="center"/>
-          </w:tcPr>
-          <w:p>
-            <w:r>
-              <w:t>Direct</w:t>
-            </w:r>
-          </w:p>
-        </w:tc>
-        <w:tc>
-          <w:tcPr>
-            <w:tcW w:type="dxa" w:w="2160"/>
-            <w:vAlign w:val="center"/>
-          </w:tcPr>
-          <w:p>
-            <w:r>
-              <w:t>Client-server execution, processes, file paths, sessions, environment variables and secure separation of services.</w:t>
-            </w:r>
-          </w:p>
-        </w:tc>
-      </w:tr>
-      <w:tr>
-        <w:tc>
-          <w:tcPr>
-            <w:tcW w:type="dxa" w:w="2160"/>
-            <w:vAlign w:val="center"/>
-          </w:tcPr>
-          <w:p>
-            <w:r>
-              <w:t>SCS1111</w:t>
-            </w:r>
-          </w:p>
-        </w:tc>
-        <w:tc>
-          <w:tcPr>
-            <w:tcW w:type="dxa" w:w="2160"/>
-            <w:vAlign w:val="center"/>
-          </w:tcPr>
-          <w:p>
-            <w:r>
-              <w:t>Principles of Programming Languages</w:t>
-            </w:r>
-          </w:p>
-        </w:tc>
-        <w:tc>
-          <w:tcPr>
-            <w:tcW w:type="dxa" w:w="2160"/>
-            <w:vAlign w:val="center"/>
-          </w:tcPr>
-          <w:p>
-            <w:r>
-              <w:t>Direct</w:t>
-            </w:r>
-          </w:p>
-        </w:tc>
-        <w:tc>
-          <w:tcPr>
-            <w:tcW w:type="dxa" w:w="2160"/>
-            <w:vAlign w:val="center"/>
-          </w:tcPr>
-          <w:p>
-            <w:r>
-              <w:t>Procedural and event-driven JavaScript/Python, functions, abstraction, objects, callbacks and runtime behavior.</w:t>
-            </w:r>
-          </w:p>
-        </w:tc>
-      </w:tr>
-      <w:tr>
-        <w:tc>
-          <w:tcPr>
-            <w:tcW w:type="dxa" w:w="2160"/>
-            <w:vAlign w:val="center"/>
-          </w:tcPr>
-          <w:p>
-            <w:r>
-              <w:t>SCS1112</w:t>
-            </w:r>
-          </w:p>
-        </w:tc>
-        <w:tc>
-          <w:tcPr>
-            <w:tcW w:type="dxa" w:w="2160"/>
-            <w:vAlign w:val="center"/>
-          </w:tcPr>
-          <w:p>
-            <w:r>
-              <w:t>Fundamentals of Digital Electronics</w:t>
-            </w:r>
-          </w:p>
-        </w:tc>
-        <w:tc>
-          <w:tcPr>
-            <w:tcW w:type="dxa" w:w="2160"/>
-            <w:vAlign w:val="center"/>
-          </w:tcPr>
-          <w:p>
-            <w:r>
-              <w:t>Indirect</w:t>
-            </w:r>
-          </w:p>
-        </w:tc>
-        <w:tc>
-          <w:tcPr>
-            <w:tcW w:type="dxa" w:w="2160"/>
-            <w:vAlign w:val="center"/>
-          </w:tcPr>
-          <w:p>
-            <w:r>
-              <w:t>Binary thinking and state representation inform Boolean controls, checkboxes, flags and digital input validation.</w:t>
-            </w:r>
-          </w:p>
-        </w:tc>
-      </w:tr>
-      <w:tr>
-        <w:tc>
-          <w:tcPr>
-            <w:tcW w:type="dxa" w:w="2160"/>
-            <w:vAlign w:val="center"/>
-          </w:tcPr>
-          <w:p>
-            <w:r>
-              <w:t>SCS1211</w:t>
-            </w:r>
-          </w:p>
-        </w:tc>
-        <w:tc>
-          <w:tcPr>
-            <w:tcW w:type="dxa" w:w="2160"/>
-            <w:vAlign w:val="center"/>
-          </w:tcPr>
-          <w:p>
-            <w:r>
-              <w:t>Computer Architecture and Organization</w:t>
-            </w:r>
-          </w:p>
-        </w:tc>
-        <w:tc>
-          <w:tcPr>
-            <w:tcW w:type="dxa" w:w="2160"/>
-            <w:vAlign w:val="center"/>
-          </w:tcPr>
-          <w:p>
-            <w:r>
-              <w:t>Indirect</w:t>
-            </w:r>
-          </w:p>
-        </w:tc>
-        <w:tc>
-          <w:tcPr>
-            <w:tcW w:type="dxa" w:w="2160"/>
-            <w:vAlign w:val="center"/>
-          </w:tcPr>
-          <w:p>
-            <w:r>
-              <w:t>Client/server and storage decisions are explained using memory, processing, input/output and locality concepts.</w:t>
-            </w:r>
-          </w:p>
-        </w:tc>
-      </w:tr>
-      <w:tr>
-        <w:tc>
-          <w:tcPr>
-            <w:tcW w:type="dxa" w:w="2160"/>
-            <w:vAlign w:val="center"/>
-          </w:tcPr>
-          <w:p>
-            <w:r>
-              <w:t>SCS1212</w:t>
-            </w:r>
-          </w:p>
-        </w:tc>
-        <w:tc>
-          <w:tcPr>
-            <w:tcW w:type="dxa" w:w="2160"/>
-            <w:vAlign w:val="center"/>
-          </w:tcPr>
-          <w:p>
-            <w:r>
-              <w:t>Data Structures and Algorithms</w:t>
-            </w:r>
-          </w:p>
-        </w:tc>
-        <w:tc>
-          <w:tcPr>
-            <w:tcW w:type="dxa" w:w="2160"/>
-            <w:vAlign w:val="center"/>
-          </w:tcPr>
-          <w:p>
-            <w:r>
-              <w:t>Direct</w:t>
-            </w:r>
-          </w:p>
-        </w:tc>
-        <w:tc>
-          <w:tcPr>
-            <w:tcW w:type="dxa" w:w="2160"/>
-            <w:vAlign w:val="center"/>
-          </w:tcPr>
-          <w:p>
-            <w:r>
-              <w:t>Arrays, objects/maps, lists, linear search, filtering, aggregation, complexity and progress calculation.</w:t>
-            </w:r>
-          </w:p>
-        </w:tc>
-      </w:tr>
-      <w:tr>
-        <w:tc>
-          <w:tcPr>
-            <w:tcW w:type="dxa" w:w="2160"/>
-            <w:vAlign w:val="center"/>
-          </w:tcPr>
-          <w:p>
-            <w:r>
-              <w:t>SCS1213</w:t>
-            </w:r>
-          </w:p>
-        </w:tc>
-        <w:tc>
-          <w:tcPr>
-            <w:tcW w:type="dxa" w:w="2160"/>
-            <w:vAlign w:val="center"/>
-          </w:tcPr>
-          <w:p>
-            <w:r>
-              <w:t>Database Systems</w:t>
-            </w:r>
-          </w:p>
-        </w:tc>
-        <w:tc>
-          <w:tcPr>
-            <w:tcW w:type="dxa" w:w="2160"/>
-            <w:vAlign w:val="center"/>
-          </w:tcPr>
-          <w:p>
-            <w:r>
-              <w:t>Direct</w:t>
-            </w:r>
-          </w:p>
-        </w:tc>
-        <w:tc>
-          <w:tcPr>
-            <w:tcW w:type="dxa" w:w="2160"/>
-            <w:vAlign w:val="center"/>
-          </w:tcPr>
-          <w:p>
-            <w:r>
-              <w:t>SQLite users table, SQL queries, uniqueness constraints, CRUD operations and password-hash persistence.</w:t>
-            </w:r>
-          </w:p>
-        </w:tc>
-      </w:tr>
-      <w:tr>
-        <w:tc>
-          <w:tcPr>
-            <w:tcW w:type="dxa" w:w="2160"/>
-            <w:vAlign w:val="center"/>
-          </w:tcPr>
-          <w:p>
-            <w:r>
-              <w:t>SCS1214</w:t>
-            </w:r>
-          </w:p>
-        </w:tc>
-        <w:tc>
-          <w:tcPr>
-            <w:tcW w:type="dxa" w:w="2160"/>
-            <w:vAlign w:val="center"/>
-          </w:tcPr>
-          <w:p>
-            <w:r>
-              <w:t>Software Engineering</w:t>
-            </w:r>
-          </w:p>
-        </w:tc>
-        <w:tc>
-          <w:tcPr>
-            <w:tcW w:type="dxa" w:w="2160"/>
-            <w:vAlign w:val="center"/>
-          </w:tcPr>
-          <w:p>
-            <w:r>
-              <w:t>Direct</w:t>
-            </w:r>
-          </w:p>
-        </w:tc>
-        <w:tc>
-          <w:tcPr>
-            <w:tcW w:type="dxa" w:w="2160"/>
-            <w:vAlign w:val="center"/>
-          </w:tcPr>
-          <w:p>
-            <w:r>
-              <w:t>Requirements, modular design, testing, version control, documentation, deployment and maintenance.</w:t>
-            </w:r>
-          </w:p>
-        </w:tc>
-      </w:tr>
-      <w:tr>
-        <w:tc>
-          <w:tcPr>
-            <w:tcW w:type="dxa" w:w="2160"/>
-            <w:vAlign w:val="center"/>
-          </w:tcPr>
-          <w:p>
-            <w:r>
-              <w:t>SCS1210</w:t>
-            </w:r>
-          </w:p>
-        </w:tc>
-        <w:tc>
-          <w:tcPr>
-            <w:tcW w:type="dxa" w:w="2160"/>
-            <w:vAlign w:val="center"/>
-          </w:tcPr>
-          <w:p>
-            <w:r>
-              <w:t>Discrete Mathematics</w:t>
-            </w:r>
-          </w:p>
-        </w:tc>
-        <w:tc>
-          <w:tcPr>
-            <w:tcW w:type="dxa" w:w="2160"/>
-            <w:vAlign w:val="center"/>
-          </w:tcPr>
-          <w:p>
-            <w:r>
-              <w:t>Direct</w:t>
-            </w:r>
-          </w:p>
-        </w:tc>
-        <w:tc>
-          <w:tcPr>
-            <w:tcW w:type="dxa" w:w="2160"/>
-            <w:vAlign w:val="center"/>
-          </w:tcPr>
-          <w:p>
-            <w:r>
-              <w:t>Sets, predicates, logical validation, relations between users/modules/records and finite weighted calculations.</w:t>
-            </w:r>
-          </w:p>
-        </w:tc>
-      </w:tr>
-      <w:tr>
-        <w:tc>
-          <w:tcPr>
-            <w:tcW w:type="dxa" w:w="2160"/>
-            <w:vAlign w:val="center"/>
-          </w:tcPr>
-          <w:p>
-            <w:r>
-              <w:t>SCS1215</w:t>
-            </w:r>
-          </w:p>
-        </w:tc>
-        <w:tc>
-          <w:tcPr>
-            <w:tcW w:type="dxa" w:w="2160"/>
-            <w:vAlign w:val="center"/>
-          </w:tcPr>
-          <w:p>
-            <w:r>
-              <w:t>Ethics and Professionalism</w:t>
-            </w:r>
-          </w:p>
-        </w:tc>
-        <w:tc>
-          <w:tcPr>
-            <w:tcW w:type="dxa" w:w="2160"/>
-            <w:vAlign w:val="center"/>
-          </w:tcPr>
-          <w:p>
-            <w:r>
-              <w:t>Direct</w:t>
-            </w:r>
-          </w:p>
-        </w:tc>
-        <w:tc>
-          <w:tcPr>
-            <w:tcW w:type="dxa" w:w="2160"/>
-            <w:vAlign w:val="center"/>
-          </w:tcPr>
-          <w:p>
-            <w:r>
-              <w:t>Privacy, password hashing, HTTP-only sessions, responsible data handling and limitations of self-reported evidence.</w:t>
-            </w:r>
-          </w:p>
-        </w:tc>
-      </w:tr>
-      <w:tr>
-        <w:tc>
-          <w:tcPr>
-            <w:tcW w:type="dxa" w:w="2160"/>
-            <w:vAlign w:val="center"/>
-          </w:tcPr>
-          <w:p>
-            <w:r>
-              <w:t>SORS2107</w:t>
-            </w:r>
-          </w:p>
-        </w:tc>
-        <w:tc>
-          <w:tcPr>
-            <w:tcW w:type="dxa" w:w="2160"/>
-            <w:vAlign w:val="center"/>
-          </w:tcPr>
-          <w:p>
-            <w:r>
-              <w:t>Applied Statistics for Computing</w:t>
-            </w:r>
-          </w:p>
-        </w:tc>
-        <w:tc>
-          <w:tcPr>
-            <w:tcW w:type="dxa" w:w="2160"/>
-            <w:vAlign w:val="center"/>
-          </w:tcPr>
-          <w:p>
-            <w:r>
-              <w:t>Direct</w:t>
-            </w:r>
-          </w:p>
-        </w:tc>
-        <w:tc>
-          <w:tcPr>
-            <w:tcW w:type="dxa" w:w="2160"/>
-            <w:vAlign w:val="center"/>
-          </w:tcPr>
-          <w:p>
-            <w:r>
-              <w:t>Quiz averages, attendance percentages, marks and the weighted academic progress calculation.</w:t>
-            </w:r>
-          </w:p>
-        </w:tc>
-      </w:tr>
-      <w:tr>
-        <w:tc>
-          <w:tcPr>
-            <w:tcW w:type="dxa" w:w="2160"/>
-            <w:vAlign w:val="center"/>
-          </w:tcPr>
-          <w:p>
-            <w:r>
-              <w:t>SCS2104</w:t>
-            </w:r>
-          </w:p>
-        </w:tc>
-        <w:tc>
-          <w:tcPr>
-            <w:tcW w:type="dxa" w:w="2160"/>
-            <w:vAlign w:val="center"/>
-          </w:tcPr>
-          <w:p>
-            <w:r>
-              <w:t>Structured System Analysis and Design</w:t>
-            </w:r>
-          </w:p>
-        </w:tc>
-        <w:tc>
-          <w:tcPr>
-            <w:tcW w:type="dxa" w:w="2160"/>
-            <w:vAlign w:val="center"/>
-          </w:tcPr>
-          <w:p>
-            <w:r>
-              <w:t>Direct</w:t>
-            </w:r>
-          </w:p>
-        </w:tc>
-        <w:tc>
-          <w:tcPr>
-            <w:tcW w:type="dxa" w:w="2160"/>
-            <w:vAlign w:val="center"/>
-          </w:tcPr>
-          <w:p>
-            <w:r>
-              <w:t>Requirements analysis, actor identification, data flows, module decomposition, documentation and workflow design.</w:t>
-            </w:r>
-          </w:p>
-        </w:tc>
-      </w:tr>
-      <w:tr>
-        <w:tc>
-          <w:tcPr>
-            <w:tcW w:type="dxa" w:w="2160"/>
-            <w:vAlign w:val="center"/>
-          </w:tcPr>
-          <w:p>
-            <w:r>
-              <w:t>SCS2114</w:t>
-            </w:r>
-          </w:p>
-        </w:tc>
-        <w:tc>
-          <w:tcPr>
-            <w:tcW w:type="dxa" w:w="2160"/>
-            <w:vAlign w:val="center"/>
-          </w:tcPr>
-          <w:p>
-            <w:r>
-              <w:t>Web Development</w:t>
-            </w:r>
-          </w:p>
-        </w:tc>
-        <w:tc>
-          <w:tcPr>
-            <w:tcW w:type="dxa" w:w="2160"/>
-            <w:vAlign w:val="center"/>
-          </w:tcPr>
-          <w:p>
-            <w:r>
-              <w:t>Direct</w:t>
-            </w:r>
-          </w:p>
-        </w:tc>
-        <w:tc>
-          <w:tcPr>
-            <w:tcW w:type="dxa" w:w="2160"/>
-            <w:vAlign w:val="center"/>
-          </w:tcPr>
-          <w:p>
-            <w:r>
-              <w:t>Responsive HTML/CSS/JavaScript interface, Flask routes, forms, JSON requests, static deployment and database connection.</w:t>
-            </w:r>
-          </w:p>
-        </w:tc>
-      </w:tr>
-    </w:tbl>
+    <w:p>
+      <w:pPr>
+        <w:pStyle w:val="Heading1"/>
+      </w:pPr>
+      <w:r>
+        <w:t>12. Presentation conclusion</w:t>
+      </w:r>
+    </w:p>
+    <w:p>
+      <w:r>
+        <w:t>MyNUST demonstrates how a student problem can be transformed into a structured web system. It combines requirements analysis, responsive interface design, programming, algorithms, data structures, databases, security, statistics and professional ethics. The project is aligned with the three current Level II modules while showing how the wider 16-module foundation contributes to the design and implementation.</w:t>
+      </w:r>
+    </w:p>
     <w:sectPr>
       <w:pgSz w:w="12240" w:h="15840"/>
       <w:pgMar w:top="1440" w:right="1800" w:bottom="1440" w:left="1800" w:header="720" w:footer="720" w:gutter="0"/>

</xml_diff>